<commit_message>
Fase 4.3 y 4.4: verificación de principio a fin y formato documental (DOC-10)
- Comprobación en el navegador: entrevista contestada desde la interfaz; panel,
  Markdown y manifiesto coinciden en clasificación, alerta y huella.
- docs/formato-documental.md: la herramienta genera borradores (OOXML
  Transitional y Markdown) y el manifiesto; PDF/A, metadatos ENI, firma y CSV
  corresponden al gestor de expedientes. Cotejados Ley 39/2015 (Arts. 26 y 70),
  NTI de Documento Electrónico y NTI de Catálogo de estándares.
- Metadatos de fichero en los DOCX (título, autor, descripción) en lugar de
  «Un-named». Corregido «1 respuestas sin contestar».
</commit_message>
<xml_diff>
--- a/Resultados prueba app analizador ayudas/Expediente_Analizador_Ayudas.docx
+++ b/Resultados prueba app analizador ayudas/Expediente_Analizador_Ayudas.docx
@@ -128,7 +128,7 @@
                 <w:sz w:val="18"/>
                 <w:szCs w:val="18"/>
               </w:rPr>
-              <w:t xml:space="preserve">EXP-IA-2026-6752</w:t>
+              <w:t xml:space="preserve">EXP-IA-2026-8128</w:t>
             </w:r>
           </w:p>
         </w:tc>
@@ -3030,7 +3030,7 @@
           <w:sz w:val="20"/>
           <w:szCs w:val="20"/>
         </w:rPr>
-        <w:t xml:space="preserve">Fecha de generación: 2026-10-07T17:58:08.787Z</w:t>
+        <w:t xml:space="preserve">Fecha de generación: 2026-10-07T18:03:44.439Z</w:t>
       </w:r>
     </w:p>
     <w:p>

</xml_diff>

<commit_message>
Fase 5.1: ejemplos regenerados con «requisitos por validar»
</commit_message>
<xml_diff>
--- a/Resultados prueba app analizador ayudas/Expediente_Analizador_Ayudas.docx
+++ b/Resultados prueba app analizador ayudas/Expediente_Analizador_Ayudas.docx
@@ -128,7 +128,7 @@
                 <w:sz w:val="18"/>
                 <w:szCs w:val="18"/>
               </w:rPr>
-              <w:t xml:space="preserve">EXP-IA-2026-8128</w:t>
+              <w:t xml:space="preserve">EXP-IA-2026-9880</w:t>
             </w:r>
           </w:p>
         </w:tc>
@@ -568,7 +568,7 @@
         <w:spacing w:after="200"/>
       </w:pPr>
       <w:r>
-        <w:t xml:space="preserve">Diagnóstico preliminar para "Analizador de convocatorias de ayudas y subvenciones": según lo declarado, el sistema se clasifica como Riesgo de Transparencia (Riesgo Limitado - Art. 50 RIA). Quedan 17 requisitos sin acreditar. Categoría ENS: BASICA. Las conclusiones se basan en la entrevista y en la documentación aportada; requieren la validación del órgano competente, del Responsable de Seguridad y del Delegado de Protección de Datos.</w:t>
+        <w:t xml:space="preserve">Diagnóstico preliminar para "Analizador de convocatorias de ayudas y subvenciones": según lo declarado, el sistema se clasifica como Riesgo de Transparencia (Riesgo Limitado - Art. 50 RIA). Quedan 17 requisitos por validar (los acredita una persona con evidencia). Categoría ENS: BASICA. Las conclusiones se basan en la entrevista y en la documentación aportada; requieren la validación del órgano competente, del Responsable de Seguridad y del Delegado de Protección de Datos.</w:t>
       </w:r>
     </w:p>
     <w:tbl>
@@ -809,7 +809,7 @@
                 <w:sz w:val="15"/>
                 <w:szCs w:val="15"/>
               </w:rPr>
-              <w:t xml:space="preserve">11 requisitos sin acreditar</w:t>
+              <w:t xml:space="preserve">11 requisitos por validar</w:t>
             </w:r>
           </w:p>
         </w:tc>
@@ -991,7 +991,7 @@
                 <w:sz w:val="15"/>
                 <w:szCs w:val="15"/>
               </w:rPr>
-              <w:t xml:space="preserve">3 requisitos sin acreditar</w:t>
+              <w:t xml:space="preserve">3 requisitos por validar</w:t>
             </w:r>
           </w:p>
         </w:tc>
@@ -1082,7 +1082,7 @@
                 <w:sz w:val="15"/>
                 <w:szCs w:val="15"/>
               </w:rPr>
-              <w:t xml:space="preserve">3 requisitos sin acreditar</w:t>
+              <w:t xml:space="preserve">3 requisitos por validar</w:t>
             </w:r>
           </w:p>
         </w:tc>
@@ -1103,7 +1103,7 @@
           <w:bCs/>
           <w:color w:val="D97706"/>
         </w:rPr>
-        <w:t xml:space="preserve">Conclusión preliminar: PENDIENTE DE VALIDACIÓN. 17 requisitos sin acreditar. Las conclusiones se basan en lo declarado y deben validarlas el órgano competente, el Responsable de Seguridad y el DPD.</w:t>
+        <w:t xml:space="preserve">Conclusión preliminar: PENDIENTE DE VALIDACIÓN HUMANA. 17 requisitos por validar: contestar la entrevista no los acredita; los acredita una persona registrando la validación con su evidencia. Las conclusiones se basan en lo declarado y deben validarlas el órgano competente, el Responsable de Seguridad y el DPD.</w:t>
       </w:r>
     </w:p>
     <w:p>
@@ -3030,7 +3030,7 @@
           <w:sz w:val="20"/>
           <w:szCs w:val="20"/>
         </w:rPr>
-        <w:t xml:space="preserve">Fecha de generación: 2026-10-07T18:03:44.439Z</w:t>
+        <w:t xml:space="preserve">Fecha de generación: 2026-10-07T21:26:37.415Z</w:t>
       </w:r>
     </w:p>
     <w:p>

</xml_diff>

<commit_message>
Fase 5.3: sugerencias de respuesta que nunca se aplican solas (SUG-01 a SUG-03)
- interviewSuggestions.ts: sugerencias con IA a petición (por pregunta o para
  todas las pendientes, un bloque por llamada) e indicios sin IA. La app
  comprueba la cita literal; sin ella, la sugerencia es «inferida». Un «no» en
  prácticas prohibidas, datos sensibles o perfilado es siempre inferido. En las
  decisiones de la entidad la IA solo orienta.
- Aceptar una a una, o en bloque solo las de cita comprobada. Confirmación
  antes de enviar la documentación a un servicio externo; nada se envía si se
  declaran datos de los Arts. 9/10 RGPD.
- answerSources: origen de cada respuesta (persona, IA con modelo y cita, o
  indicio); tabla «Origen de las respuestas» en DOCX, Markdown y manifiesto.
</commit_message>
<xml_diff>
--- a/Resultados prueba app analizador ayudas/Expediente_Analizador_Ayudas.docx
+++ b/Resultados prueba app analizador ayudas/Expediente_Analizador_Ayudas.docx
@@ -128,7 +128,7 @@
                 <w:sz w:val="18"/>
                 <w:szCs w:val="18"/>
               </w:rPr>
-              <w:t xml:space="preserve">EXP-IA-2026-9880</w:t>
+              <w:t xml:space="preserve">EXP-IA-2026-4401</w:t>
             </w:r>
           </w:p>
         </w:tc>
@@ -174,7 +174,7 @@
                 <w:sz w:val="18"/>
                 <w:szCs w:val="18"/>
               </w:rPr>
-              <w:t xml:space="preserve">7/10/2026</w:t>
+              <w:t xml:space="preserve">8/10/2026</w:t>
             </w:r>
           </w:p>
         </w:tc>
@@ -3030,7 +3030,7 @@
           <w:sz w:val="20"/>
           <w:szCs w:val="20"/>
         </w:rPr>
-        <w:t xml:space="preserve">Fecha de generación: 2026-10-07T21:26:37.415Z</w:t>
+        <w:t xml:space="preserve">Fecha de generación: 2026-10-07T23:04:28.335Z</w:t>
       </w:r>
     </w:p>
     <w:p>
@@ -3048,6 +3048,36 @@
           <w:szCs w:val="20"/>
         </w:rPr>
         <w:t xml:space="preserve">Asistencia de IA: No se usó ningún modelo de IA: el diagnóstico procede solo del motor determinista.</w:t>
+      </w:r>
+    </w:p>
+    <w:p>
+      <w:pPr>
+        <w:spacing w:after="100" w:before="200"/>
+      </w:pPr>
+      <w:r>
+        <w:rPr>
+          <w:b/>
+          <w:bCs/>
+          <w:color w:val="1E3A8A"/>
+        </w:rPr>
+        <w:t xml:space="preserve">Origen de las respuestas</w:t>
+      </w:r>
+    </w:p>
+    <w:p>
+      <w:pPr>
+        <w:pStyle w:val="ListParagraph"/>
+        <w:numPr>
+          <w:ilvl w:val="0"/>
+          <w:numId w:val="1"/>
+        </w:numPr>
+        <w:spacing w:after="80"/>
+      </w:pPr>
+      <w:r>
+        <w:rPr>
+          <w:sz w:val="20"/>
+          <w:szCs w:val="20"/>
+        </w:rPr>
+        <w:t xml:space="preserve">Todas las respuestas las introdujo la persona usuaria.</w:t>
       </w:r>
     </w:p>
     <w:p>

</xml_diff>

<commit_message>
Casos de aplicaciones reales y datos de solvencia (EIPD-06, IND-01)
- Tres aplicaciones reales de la Diputación de Lugo como casos de referencia
  (Calculadora LCSP, Monitor BOE y Asistente de notas de prensa); el analizador
  de ayudas pasa a usar su README real. La documentación se guarda con su commit
  en src/test/casos-reales/. Las respuestas de la entrevista son un borrador que
  debe confirmar el autor.
- EIPD-06: nueva pregunta sobre datos de solvencia de personas físicas, que
  activa el criterio 4 de la lista de la AEPD. La ayuda aclara que los datos de
  fuentes públicas (BOE) siguen sujetos al RGPD.
- IND-01: el indicio de uso de IA ya no salta con frases sobre cómo se
  desarrolló la aplicación, la estrategia de IA de la entidad o su autor.
- Los casos de referencia pueden fijar el cribado de la EIPD; ejemplos
  regenerados (14 casos, 0 discrepancias). 199 pruebas en verde.
</commit_message>
<xml_diff>
--- a/Resultados prueba app analizador ayudas/Expediente_Analizador_Ayudas.docx
+++ b/Resultados prueba app analizador ayudas/Expediente_Analizador_Ayudas.docx
@@ -128,7 +128,7 @@
                 <w:sz w:val="18"/>
                 <w:szCs w:val="18"/>
               </w:rPr>
-              <w:t xml:space="preserve">EXP-IA-2026-4401</w:t>
+              <w:t xml:space="preserve">EXP-IA-2026-9937</w:t>
             </w:r>
           </w:p>
         </w:tc>
@@ -174,7 +174,7 @@
                 <w:sz w:val="18"/>
                 <w:szCs w:val="18"/>
               </w:rPr>
-              <w:t xml:space="preserve">8/10/2026</w:t>
+              <w:t xml:space="preserve">9/10/2026</w:t>
             </w:r>
           </w:p>
         </w:tc>
@@ -1299,7 +1299,7 @@
         <w:t xml:space="preserve">Datos de Entrada / Contexto Técnico: </w:t>
       </w:r>
       <w:r>
-        <w:t xml:space="preserve">Arquitectura web y APIs de inferencia LLM.</w:t>
+        <w:t xml:space="preserve">@google/genai, @radix-ui/react-dialog, @radix-ui/react-slot, @radix-ui/react-tabs, clsx, docx, file-saver, lucide-react, mammoth, marked, pdfjs-dist, react, react-dom, react-markdown, remark-gfm, tailwind-merge</w:t>
       </w:r>
     </w:p>
     <w:p>
@@ -1732,7 +1732,7 @@
           <w:sz w:val="18"/>
           <w:szCs w:val="18"/>
         </w:rPr>
-        <w:t xml:space="preserve">Uso de IA: «s una solucion de software asistido por inteligencia artificial disenada exclusivamente para prestar **» · Ámbito empleo: «ntajes de cofinanciacion y criterios de baremacion. --- ## 2. arquitectura de modelos e» · Ámbito biometria: «liacion sindical, origen racial o datos biometricos. - **prohibicion de datos personales id»</w:t>
+        <w:t xml:space="preserve">Uso de IA: «style=for-the-badge&amp;logo=tailwindcss) ![gemini ai](https://img.shields.io/badge/google» · Ámbito empleo: «ntajes de cofinanciacion y criterios de baremacion. --- ## 2. arquitectura de modelos e» · Ámbito biometria: «liacion sindical, origen racial o datos biometricos. - **prohibicion de datos personales id»</w:t>
       </w:r>
       <w:r>
         <w:rPr>
@@ -3013,7 +3013,7 @@
           <w:sz w:val="20"/>
           <w:szCs w:val="20"/>
         </w:rPr>
-        <w:t xml:space="preserve">Huella SHA-256 de las entradas (ingesta y entrevista): 3d6105e3026971d946f76d1c0582482abce4138a29022a5712863389623e1513 (permite comprobar que dos documentos parten de las mismas entradas; no acredita la integridad del documento)</w:t>
+        <w:t xml:space="preserve">Huella SHA-256 de las entradas (ingesta y entrevista): 934183224ab0851f8aedc0729e73eea956c9d882c8b76c9a8ce662117b0a9086 (permite comprobar que dos documentos parten de las mismas entradas; no acredita la integridad del documento)</w:t>
       </w:r>
     </w:p>
     <w:p>
@@ -3030,7 +3030,7 @@
           <w:sz w:val="20"/>
           <w:szCs w:val="20"/>
         </w:rPr>
-        <w:t xml:space="preserve">Fecha de generación: 2026-10-07T23:04:28.335Z</w:t>
+        <w:t xml:space="preserve">Fecha de generación: 2026-10-08T22:25:13.936Z</w:t>
       </w:r>
     </w:p>
     <w:p>

</xml_diff>

<commit_message>
Fase 6.1: brechas de datos personales y versión 2.2.0 (BRE-01)
- Pregunta breachProcedure en el bloque G y requisito RGPD-BRECHAS
  (Arts. 33 y 34 RGPD, cotejados en EUR-Lex): «sí» declarado, «no» incumple,
  «no lo sé» pendiente. La acción indica el plazo de 72 horas y las
  herramientas Asesora Brecha y Comunica-Brecha RGPD de la AEPD.
- Dato declarado en el Markdown y el manifiesto; ayuda en lenguaje sencillo.
- Apartado «Brechas e incidentes en la propia herramienta» en
  docs/custodia-historial.md.
- Motor y paquete en la versión 2.2.0: cambian las conclusiones del motor
  (EIPD-06 y BRE-01).
- Registro de fuentes, guía de uso, matriz y ejemplos actualizados.
  200 pruebas en verde.
</commit_message>
<xml_diff>
--- a/Resultados prueba app analizador ayudas/Expediente_Analizador_Ayudas.docx
+++ b/Resultados prueba app analizador ayudas/Expediente_Analizador_Ayudas.docx
@@ -128,7 +128,7 @@
                 <w:sz w:val="18"/>
                 <w:szCs w:val="18"/>
               </w:rPr>
-              <w:t xml:space="preserve">EXP-IA-2026-9937</w:t>
+              <w:t xml:space="preserve">EXP-IA-2026-8216</w:t>
             </w:r>
           </w:p>
         </w:tc>
@@ -174,7 +174,7 @@
                 <w:sz w:val="18"/>
                 <w:szCs w:val="18"/>
               </w:rPr>
-              <w:t xml:space="preserve">9/10/2026</w:t>
+              <w:t xml:space="preserve">10/10/2026</w:t>
             </w:r>
           </w:p>
         </w:tc>
@@ -517,7 +517,7 @@
                 <w:sz w:val="16"/>
                 <w:szCs w:val="16"/>
               </w:rPr>
-              <w:t xml:space="preserve">El presente informe técnico ha sido generado mediante una herramienta automatizada de diagnóstico (motor v2.1.0) a partir de lo declarado por el promotor. No es un acto administrativo ni acredita el cumplimiento: la calificación definitiva y la asunción de riesgos corresponden al órgano competente, con la revisión expresa del DPD y del Responsable de Seguridad.</w:t>
+              <w:t xml:space="preserve">El presente informe técnico ha sido generado mediante una herramienta automatizada de diagnóstico (motor v2.2.0) a partir de lo declarado por el promotor. No es un acto administrativo ni acredita el cumplimiento: la calificación definitiva y la asunción de riesgos corresponden al órgano competente, con la revisión expresa del DPD y del Responsable de Seguridad.</w:t>
             </w:r>
           </w:p>
         </w:tc>
@@ -2841,6 +2841,65 @@
           <w:b/>
           <w:bCs/>
         </w:rPr>
+        <w:t xml:space="preserve">Gestión y notificación de brechas de datos personales: </w:t>
+      </w:r>
+      <w:r>
+        <w:rPr>
+          <w:b/>
+          <w:bCs/>
+          <w:color w:val="64748B"/>
+        </w:rPr>
+        <w:t xml:space="preserve">No aplica</w:t>
+      </w:r>
+    </w:p>
+    <w:p>
+      <w:pPr>
+        <w:spacing w:after="40"/>
+      </w:pPr>
+      <w:r>
+        <w:rPr>
+          <w:color w:val="64748B"/>
+          <w:sz w:val="16"/>
+          <w:szCs w:val="16"/>
+        </w:rPr>
+        <w:t xml:space="preserve">RGPD (UE 2016/679) · Arts. 33 y 34 · Declaración del promotor</w:t>
+      </w:r>
+    </w:p>
+    <w:p>
+      <w:pPr>
+        <w:spacing w:after="40"/>
+      </w:pPr>
+      <w:r>
+        <w:rPr>
+          <w:sz w:val="19"/>
+          <w:szCs w:val="19"/>
+        </w:rPr>
+        <w:t xml:space="preserve">Declarado que no se tratan datos personales.</w:t>
+      </w:r>
+    </w:p>
+    <w:p>
+      <w:pPr>
+        <w:spacing w:after="80"/>
+      </w:pPr>
+      <w:r>
+        <w:rPr>
+          <w:i/>
+          <w:iCs/>
+          <w:sz w:val="19"/>
+          <w:szCs w:val="19"/>
+        </w:rPr>
+        <w:t xml:space="preserve">Acción: Prever cómo se detecta y documenta cualquier brecha (Art. 33.5) y quién la notifica a la AEPD sin dilación indebida y, de ser posible, en 72 horas (Art. 33.1), y a los interesados si entraña un alto riesgo (Art. 34). La AEPD ofrece las herramientas Asesora Brecha (notificación) y Comunica-Brecha RGPD (comunicación a los interesados).</w:t>
+      </w:r>
+    </w:p>
+    <w:p>
+      <w:pPr>
+        <w:spacing w:after="40" w:before="120"/>
+      </w:pPr>
+      <w:r>
+        <w:rPr>
+          <w:b/>
+          <w:bCs/>
+        </w:rPr>
         <w:t xml:space="preserve">Actuación administrativa automatizada: </w:t>
       </w:r>
       <w:r>
@@ -2996,7 +3055,7 @@
           <w:sz w:val="20"/>
           <w:szCs w:val="20"/>
         </w:rPr>
-        <w:t xml:space="preserve">Versión del motor: 2.1.0</w:t>
+        <w:t xml:space="preserve">Versión del motor: 2.2.0</w:t>
       </w:r>
     </w:p>
     <w:p>
@@ -3013,7 +3072,7 @@
           <w:sz w:val="20"/>
           <w:szCs w:val="20"/>
         </w:rPr>
-        <w:t xml:space="preserve">Huella SHA-256 de las entradas (ingesta y entrevista): 934183224ab0851f8aedc0729e73eea956c9d882c8b76c9a8ce662117b0a9086 (permite comprobar que dos documentos parten de las mismas entradas; no acredita la integridad del documento)</w:t>
+        <w:t xml:space="preserve">Huella SHA-256 de las entradas (ingesta y entrevista): 9946c3ccaa73efe9852243faa63be73ea19e337804637ea595bfbff952ac1fd8 (permite comprobar que dos documentos parten de las mismas entradas; no acredita la integridad del documento)</w:t>
       </w:r>
     </w:p>
     <w:p>
@@ -3030,7 +3089,7 @@
           <w:sz w:val="20"/>
           <w:szCs w:val="20"/>
         </w:rPr>
-        <w:t xml:space="preserve">Fecha de generación: 2026-10-08T22:25:13.936Z</w:t>
+        <w:t xml:space="preserve">Fecha de generación: 2026-10-10T11:56:46.147Z</w:t>
       </w:r>
     </w:p>
     <w:p>

</xml_diff>

<commit_message>
Fase 6.2: alojamiento, Art. 50.4 e indicios (ALO-01, TRA-01, IND-02, IND-03)
- ALO-01: la pregunta de alojamiento sirve también para aplicaciones sin IA
  («el modelo de IA o, si no usa IA, la aplicación y sus datos»).
- TRA-01: preguntas sobre publicación de textos de interés público y control
  editorial; la acción del requisito RIA-ART-50 distingue los apartados 1, 2
  y 4 (excepción por revisión humana o control editorial). Art. 50 y
  Reglamento 2026/1744 cotejados en EUR-Lex. La clasificación no cambia.
- IND-02: «criterios de baremación» de una convocatoria deja de ser indicio
  de empleo.
- IND-03: la negación alcanza a toda la cláusula, salvo conjunción
  adversativa.
- El caso notas-de-prensa contesta las preguntas nuevas (borrador).
  Ejemplos regenerados; 205 pruebas en verde.
</commit_message>
<xml_diff>
--- a/Resultados prueba app analizador ayudas/Expediente_Analizador_Ayudas.docx
+++ b/Resultados prueba app analizador ayudas/Expediente_Analizador_Ayudas.docx
@@ -128,7 +128,7 @@
                 <w:sz w:val="18"/>
                 <w:szCs w:val="18"/>
               </w:rPr>
-              <w:t xml:space="preserve">EXP-IA-2026-8216</w:t>
+              <w:t xml:space="preserve">EXP-IA-2026-8896</w:t>
             </w:r>
           </w:p>
         </w:tc>
@@ -1732,7 +1732,7 @@
           <w:sz w:val="18"/>
           <w:szCs w:val="18"/>
         </w:rPr>
-        <w:t xml:space="preserve">Uso de IA: «style=for-the-badge&amp;logo=tailwindcss) ![gemini ai](https://img.shields.io/badge/google» · Ámbito empleo: «ntajes de cofinanciacion y criterios de baremacion. --- ## 2. arquitectura de modelos e» · Ámbito biometria: «liacion sindical, origen racial o datos biometricos. - **prohibicion de datos personales id»</w:t>
+        <w:t xml:space="preserve">Uso de IA: «style=for-the-badge&amp;logo=tailwindcss) ![gemini ai](https://img.shields.io/badge/google»</w:t>
       </w:r>
       <w:r>
         <w:rPr>
@@ -2416,7 +2416,7 @@
           <w:sz w:val="19"/>
           <w:szCs w:val="19"/>
         </w:rPr>
-        <w:t xml:space="preserve">Acción: Implantar el aviso de interacción con IA y el marcado del contenido generado, y conservar evidencia de su implantación.</w:t>
+        <w:t xml:space="preserve">Acción: Informar a las personas de que interactúan con un sistema de IA (Art. 50.1). Marcar el contenido generado en un formato legible por máquina (Art. 50.2). Corresponde al proveedor del sistema, salvo que solo apoye la edición estándar o no altere sustancialmente los datos de entrada. Conservar evidencia de lo implantado.</w:t>
       </w:r>
     </w:p>
     <w:p>
@@ -3072,7 +3072,7 @@
           <w:sz w:val="20"/>
           <w:szCs w:val="20"/>
         </w:rPr>
-        <w:t xml:space="preserve">Huella SHA-256 de las entradas (ingesta y entrevista): 9946c3ccaa73efe9852243faa63be73ea19e337804637ea595bfbff952ac1fd8 (permite comprobar que dos documentos parten de las mismas entradas; no acredita la integridad del documento)</w:t>
+        <w:t xml:space="preserve">Huella SHA-256 de las entradas (ingesta y entrevista): fc2c898c889a7a24de61cbf28baaf43afa735fa1ec9935e992aa2bd179d8a487 (permite comprobar que dos documentos parten de las mismas entradas; no acredita la integridad del documento)</w:t>
       </w:r>
     </w:p>
     <w:p>
@@ -3089,7 +3089,7 @@
           <w:sz w:val="20"/>
           <w:szCs w:val="20"/>
         </w:rPr>
-        <w:t xml:space="preserve">Fecha de generación: 2026-10-10T11:56:46.147Z</w:t>
+        <w:t xml:space="preserve">Fecha de generación: 2026-10-10T12:01:43.960Z</w:t>
       </w:r>
     </w:p>
     <w:p>

</xml_diff>

<commit_message>
Fase 6.5: remisión al modelo FRIA de la APDCAT y revisión del 5/10 como histórico (FRIA-01)
- En alto riesgo, el requisito RIA-ART-27 aclara que la evaluación de impacto
  en los derechos fundamentales complementa la EIPD (Art. 27.4) y remite, como
  guía, al modelo FRIA de la APDCAT (aplicación gratuita y local) o al
  cuestionario modelo de la Oficina de IA (Art. 27.5). Arts. 27.4 y 27.5
  cotejados en EUR-Lex; nota oficial de la APDCAT anotada en el registro de
  fuentes.
- auditoria-pericial/ pasa a docs/historico/revision-ia-linea-base-v2.0/:
  revisión hecha con un modelo de IA sobre la línea base v2.0.
- CHANGELOG, agents.md, matriz y ejemplos actualizados; 207 pruebas en verde.
</commit_message>
<xml_diff>
--- a/Resultados prueba app analizador ayudas/Expediente_Analizador_Ayudas.docx
+++ b/Resultados prueba app analizador ayudas/Expediente_Analizador_Ayudas.docx
@@ -128,7 +128,7 @@
                 <w:sz w:val="18"/>
                 <w:szCs w:val="18"/>
               </w:rPr>
-              <w:t xml:space="preserve">EXP-IA-2026-2277</w:t>
+              <w:t xml:space="preserve">EXP-IA-2026-1638</w:t>
             </w:r>
           </w:p>
         </w:tc>
@@ -3089,7 +3089,7 @@
           <w:sz w:val="20"/>
           <w:szCs w:val="20"/>
         </w:rPr>
-        <w:t xml:space="preserve">Fecha de generación: 2026-10-10T12:38:01.351Z</w:t>
+        <w:t xml:space="preserve">Fecha de generación: 2026-10-10T19:40:50.361Z</w:t>
       </w:r>
     </w:p>
     <w:p>

</xml_diff>

<commit_message>
Fase 6.6: prueba con Oasis-Madrid; adaptación al caso y textos (UX-03, EIPD-08, SUG-04, ADM-01, DOC-16)
- Solo se muestra lo que aplica (stepAvailability.ts): sin IA no se ofrecen el
  kit de código ni las pruebas del modelo; sin datos personales, la EIPD dice
  «No procede». Con «no lo sé» se muestra todo. Pasos renumerados según los
  visibles.
- Las sugerencias sobre el Art. 3.1 y el Art. 41 son siempre «inferidas»: una
  cita comprobada no basta para una calificación jurídica.
- Nueva pregunta «¿produce o prepara actos administrativos?»: si no, el Art.
  41 no aplica, no se pregunta por el empleado público ni hay alerta de
  control humano.
- Se retira la diligencia con huella e identificador del documento; textos
  que prometían de más rebajados; ejemplos de modelos sin versión. Una prueba
  impide que reaparezcan.
- Oasis-Madrid, quinto caso real (sin IA); IND-01 ampliado.
- Logo de la cabecera más compacto.
- 222 pruebas en verde; 15 casos sin discrepancias.
</commit_message>
<xml_diff>
--- a/Resultados prueba app analizador ayudas/Expediente_Analizador_Ayudas.docx
+++ b/Resultados prueba app analizador ayudas/Expediente_Analizador_Ayudas.docx
@@ -128,7 +128,7 @@
                 <w:sz w:val="18"/>
                 <w:szCs w:val="18"/>
               </w:rPr>
-              <w:t xml:space="preserve">EXP-IA-2026-1638</w:t>
+              <w:t xml:space="preserve">EXP-IA-2026-8438</w:t>
             </w:r>
           </w:p>
         </w:tc>
@@ -174,7 +174,7 @@
                 <w:sz w:val="18"/>
                 <w:szCs w:val="18"/>
               </w:rPr>
-              <w:t xml:space="preserve">10/10/2026</w:t>
+              <w:t xml:space="preserve">13/10/2026</w:t>
             </w:r>
           </w:p>
         </w:tc>
@@ -3072,7 +3072,7 @@
           <w:sz w:val="20"/>
           <w:szCs w:val="20"/>
         </w:rPr>
-        <w:t xml:space="preserve">Huella SHA-256 de las entradas (ingesta y entrevista): fc2c898c889a7a24de61cbf28baaf43afa735fa1ec9935e992aa2bd179d8a487 (permite comprobar que dos documentos parten de las mismas entradas; no acredita la integridad del documento)</w:t>
+        <w:t xml:space="preserve">Huella SHA-256 de las entradas (ingesta y entrevista): 04903c48a09f2e6353302efe771b7400a1dfffaf075f3357d4a32c8618875f17 (permite comprobar que dos documentos parten de las mismas entradas; no acredita la integridad del documento)</w:t>
       </w:r>
     </w:p>
     <w:p>
@@ -3089,7 +3089,7 @@
           <w:sz w:val="20"/>
           <w:szCs w:val="20"/>
         </w:rPr>
-        <w:t xml:space="preserve">Fecha de generación: 2026-10-10T19:40:50.361Z</w:t>
+        <w:t xml:space="preserve">Fecha de generación: 2026-10-12T23:22:50.441Z</w:t>
       </w:r>
     </w:p>
     <w:p>

</xml_diff>

<commit_message>
Versión 2.2.1: informes coherentes (DOC-17)
- Las respuestas de preguntas que no aplican al caso se tratan como no
  contestadas en el motor y en el Word, el Markdown y el manifiesto
  (applicableAnswers).
- Art. 41: texto común al Word y al Markdown, coherente con el requisito
  («no produce actos», «actuación automatizada», «interviene un empleado
  público» o «no consta»).
- Art. 50 en sistemas sin IA: explica que no se aplica por no ser IA.
- Sin puntos dobles; descripción del procedimiento propia de la Calculadora.
- Prueba que recorre los 15 casos y falla si un informe se contradice.
- README: programado con asistentes de IA (Claude Code) bajo la dirección
  y la revisión del autor.
</commit_message>
<xml_diff>
--- a/Resultados prueba app analizador ayudas/Expediente_Analizador_Ayudas.docx
+++ b/Resultados prueba app analizador ayudas/Expediente_Analizador_Ayudas.docx
@@ -128,7 +128,7 @@
                 <w:sz w:val="18"/>
                 <w:szCs w:val="18"/>
               </w:rPr>
-              <w:t xml:space="preserve">EXP-IA-2026-3442</w:t>
+              <w:t xml:space="preserve">EXP-IA-2026-2823</w:t>
             </w:r>
           </w:p>
         </w:tc>
@@ -517,7 +517,7 @@
                 <w:sz w:val="16"/>
                 <w:szCs w:val="16"/>
               </w:rPr>
-              <w:t xml:space="preserve">El presente informe técnico ha sido generado mediante una herramienta automatizada de diagnóstico (motor v2.2.0) a partir de lo declarado por el promotor. No es un acto administrativo ni acredita el cumplimiento: la calificación definitiva y la asunción de riesgos corresponden al órgano competente, con la revisión expresa del DPD y del Responsable de Seguridad.</w:t>
+              <w:t xml:space="preserve">El presente informe técnico ha sido generado mediante una herramienta automatizada de diagnóstico (motor v2.2.1) a partir de lo declarado por el promotor. No es un acto administrativo ni acredita el cumplimiento: la calificación definitiva y la asunción de riesgos corresponden al órgano competente, con la revisión expresa del DPD y del Responsable de Seguridad.</w:t>
             </w:r>
           </w:p>
         </w:tc>
@@ -2161,7 +2161,7 @@
         <w:spacing w:after="200"/>
       </w:pPr>
       <w:r>
-        <w:t xml:space="preserve">Deslinde con el Artículo 41 de la Ley 40/2015: el promotor declara que un empleado público interviene de forma directa en cada actuación, por lo que no habría actuación administrativa automatizada. Esta afirmación no se ha verificado y debe contrastarse con el funcionamiento real del procedimiento.</w:t>
+        <w:t xml:space="preserve">Deslinde con el Artículo 41 de la Ley 40/2015: El promotor declara que un empleado público interviene de forma directa en cada actuación, por lo que no habría actuación administrativa automatizada. Esta afirmación no se ha verificado y debe contrastarse con el funcionamiento real del procedimiento.</w:t>
       </w:r>
     </w:p>
     <w:p>
@@ -2950,7 +2950,7 @@
           <w:sz w:val="19"/>
           <w:szCs w:val="19"/>
         </w:rPr>
-        <w:t xml:space="preserve">Declarado que un empleado público interviene de forma directa. Funcionamiento descrito: El personal técnico revisa cada ficha antes de usarla; la aplicación no tramita ni resuelve.. No se ha verificado.</w:t>
+        <w:t xml:space="preserve">Declarado que un empleado público interviene de forma directa. Funcionamiento descrito: El personal técnico revisa cada ficha antes de usarla; la aplicación no tramita ni resuelve. No se ha verificado.</w:t>
       </w:r>
     </w:p>
     <w:p>
@@ -3072,7 +3072,7 @@
           <w:sz w:val="20"/>
           <w:szCs w:val="20"/>
         </w:rPr>
-        <w:t xml:space="preserve">Versión del motor: 2.2.0</w:t>
+        <w:t xml:space="preserve">Versión del motor: 2.2.1</w:t>
       </w:r>
     </w:p>
     <w:p>
@@ -3106,7 +3106,7 @@
           <w:sz w:val="20"/>
           <w:szCs w:val="20"/>
         </w:rPr>
-        <w:t xml:space="preserve">Fecha de generación: 2026-10-13T06:20:22.810Z</w:t>
+        <w:t xml:space="preserve">Fecha de generación: 2026-10-13T14:42:43.186Z</w:t>
       </w:r>
     </w:p>
     <w:p>

</xml_diff>